<commit_message>
GDD: translate to English and add a design-evolution addendum
</commit_message>
<xml_diff>
--- a/GDD.docx
+++ b/GDD.docx
@@ -1053,7 +1053,8 @@
               <w:jc w:val="left"/>
             </w:pPr>
             <w:r>
-              <w:t>战吼 (War Cry)</w:t>
+              <w:rPr/>
+              <w:t>War Cry</w:t>
             </w:r>
           </w:p>
         </w:tc>
@@ -1107,7 +1108,8 @@
               <w:jc w:val="left"/>
             </w:pPr>
             <w:r>
-              <w:t>影步 (Shadow Step)</w:t>
+              <w:rPr/>
+              <w:t>Shadow Step</w:t>
             </w:r>
           </w:p>
         </w:tc>
@@ -1161,7 +1163,8 @@
               <w:jc w:val="left"/>
             </w:pPr>
             <w:r>
-              <w:t>奥术迸发 (Arcane Surge)</w:t>
+              <w:rPr/>
+              <w:t>Arcane Surge</w:t>
             </w:r>
           </w:p>
         </w:tc>
@@ -1295,7 +1298,8 @@
               <w:jc w:val="left"/>
             </w:pPr>
             <w:r>
-              <w:t>铁甲皮肤 (Iron Skin)</w:t>
+              <w:rPr/>
+              <w:t>Iron Skin</w:t>
             </w:r>
           </w:p>
         </w:tc>
@@ -1336,7 +1340,8 @@
               <w:jc w:val="left"/>
             </w:pPr>
             <w:r>
-              <w:t>连击者 (Combo Striker)</w:t>
+              <w:rPr/>
+              <w:t>Combo Striker</w:t>
             </w:r>
           </w:p>
         </w:tc>
@@ -1377,7 +1382,8 @@
               <w:jc w:val="left"/>
             </w:pPr>
             <w:r>
-              <w:t>脆弱诅咒 (Frailty Curse)</w:t>
+              <w:rPr/>
+              <w:t>Frailty Curse</w:t>
             </w:r>
           </w:p>
         </w:tc>
@@ -1514,7 +1520,7 @@
                 <w:b/>
                 <w:color w:val="FFFFFF"/>
               </w:rPr>
-              <w:t>攻击类型</w:t>
+              <w:t>Attack Type</w:t>
             </w:r>
           </w:p>
         </w:tc>
@@ -1532,7 +1538,7 @@
                 <w:b/>
                 <w:color w:val="FFFFFF"/>
               </w:rPr>
-              <w:t>速度</w:t>
+              <w:t>Speed</w:t>
             </w:r>
           </w:p>
         </w:tc>
@@ -1550,7 +1556,7 @@
                 <w:b/>
                 <w:color w:val="FFFFFF"/>
               </w:rPr>
-              <w:t>范围</w:t>
+              <w:t>Range</w:t>
             </w:r>
           </w:p>
         </w:tc>
@@ -1586,7 +1592,7 @@
                 <w:b/>
                 <w:color w:val="FFFFFF"/>
               </w:rPr>
-              <w:t>特点</w:t>
+              <w:t>Traits</w:t>
             </w:r>
           </w:p>
         </w:tc>
@@ -1601,7 +1607,8 @@
               <w:jc w:val="left"/>
             </w:pPr>
             <w:r>
-              <w:t>Dagger 匕首</w:t>
+              <w:rPr/>
+              <w:t>Dagger</w:t>
             </w:r>
           </w:p>
         </w:tc>
@@ -1666,7 +1673,8 @@
               <w:jc w:val="left"/>
             </w:pPr>
             <w:r>
-              <w:t>极快攻速，适合刺客流派</w:t>
+              <w:rPr/>
+              <w:t>Very fast attack speed; suits assassin builds</w:t>
             </w:r>
           </w:p>
         </w:tc>
@@ -1681,7 +1689,8 @@
               <w:jc w:val="left"/>
             </w:pPr>
             <w:r>
-              <w:t>Longsword 长剑</w:t>
+              <w:rPr/>
+              <w:t>Longsword</w:t>
             </w:r>
           </w:p>
         </w:tc>
@@ -1746,7 +1755,8 @@
               <w:jc w:val="left"/>
             </w:pPr>
             <w:r>
-              <w:t>均衡近战，各英雄通用</w:t>
+              <w:rPr/>
+              <w:t>Balanced melee; universal across heroes</w:t>
             </w:r>
           </w:p>
         </w:tc>
@@ -1761,7 +1771,8 @@
               <w:jc w:val="left"/>
             </w:pPr>
             <w:r>
-              <w:t>Greatsword 双手剑</w:t>
+              <w:rPr/>
+              <w:t>Greatsword</w:t>
             </w:r>
           </w:p>
         </w:tc>
@@ -1826,7 +1837,8 @@
               <w:jc w:val="left"/>
             </w:pPr>
             <w:r>
-              <w:t>高伤慢速，大范围清场</w:t>
+              <w:rPr/>
+              <w:t>High damage, slow; clears large areas</w:t>
             </w:r>
           </w:p>
         </w:tc>
@@ -1841,7 +1853,8 @@
               <w:jc w:val="left"/>
             </w:pPr>
             <w:r>
-              <w:t>Bow 弓</w:t>
+              <w:rPr/>
+              <w:t>Bow</w:t>
             </w:r>
           </w:p>
         </w:tc>
@@ -1906,7 +1919,8 @@
               <w:jc w:val="left"/>
             </w:pPr>
             <w:r>
-              <w:t>远程直线，安全输出</w:t>
+              <w:rPr/>
+              <w:t>Ranged, straight-line; safe damage</w:t>
             </w:r>
           </w:p>
         </w:tc>
@@ -1921,7 +1935,8 @@
               <w:jc w:val="left"/>
             </w:pPr>
             <w:r>
-              <w:t>Staff 法杖</w:t>
+              <w:rPr/>
+              <w:t>Staff</w:t>
             </w:r>
           </w:p>
         </w:tc>
@@ -1986,7 +2001,8 @@
               <w:jc w:val="left"/>
             </w:pPr>
             <w:r>
-              <w:t>普攻在目标位置AOE爆炸</w:t>
+              <w:rPr/>
+              <w:t>normal attack: AoE explosion at the target position</w:t>
             </w:r>
           </w:p>
         </w:tc>
@@ -2119,7 +2135,8 @@
               <w:jc w:val="left"/>
             </w:pPr>
             <w:r>
-              <w:t>White 白</w:t>
+              <w:rPr/>
+              <w:t>White</w:t>
             </w:r>
           </w:p>
         </w:tc>
@@ -2186,7 +2203,8 @@
               <w:jc w:val="left"/>
             </w:pPr>
             <w:r>
-              <w:t>Green 绿</w:t>
+              <w:rPr/>
+              <w:t>Green</w:t>
             </w:r>
           </w:p>
         </w:tc>
@@ -2253,7 +2271,8 @@
               <w:jc w:val="left"/>
             </w:pPr>
             <w:r>
-              <w:t>Blue  蓝</w:t>
+              <w:rPr/>
+              <w:t>Blue</w:t>
             </w:r>
           </w:p>
         </w:tc>
@@ -2320,7 +2339,8 @@
               <w:jc w:val="left"/>
             </w:pPr>
             <w:r>
-              <w:t>Purple 紫</w:t>
+              <w:rPr/>
+              <w:t>Purple</w:t>
             </w:r>
           </w:p>
         </w:tc>
@@ -2543,7 +2563,8 @@
               <w:jc w:val="left"/>
             </w:pPr>
             <w:r>
-              <w:t>铁匕首</w:t>
+              <w:rPr/>
+              <w:t>Iron Dagger</w:t>
             </w:r>
           </w:p>
         </w:tc>
@@ -2636,7 +2657,8 @@
               <w:jc w:val="left"/>
             </w:pPr>
             <w:r>
-              <w:t>精铁匕首</w:t>
+              <w:rPr/>
+              <w:t>Fine Iron Dagger</w:t>
             </w:r>
           </w:p>
         </w:tc>
@@ -2729,7 +2751,8 @@
               <w:jc w:val="left"/>
             </w:pPr>
             <w:r>
-              <w:t>毒牙</w:t>
+              <w:rPr/>
+              <w:t>Venom Fang</w:t>
             </w:r>
           </w:p>
         </w:tc>
@@ -2794,7 +2817,8 @@
               <w:jc w:val="left"/>
             </w:pPr>
             <w:r>
-              <w:t>毒液喷射</w:t>
+              <w:rPr/>
+              <w:t>Venom Spray</w:t>
             </w:r>
           </w:p>
         </w:tc>
@@ -2807,7 +2831,8 @@
               <w:jc w:val="left"/>
             </w:pPr>
             <w:r>
-              <w:t>向前方AOE 80%伤+40%真实毒素追伤</w:t>
+              <w:rPr/>
+              <w:t>forward AoE, 80% damage + 40% true poison DoT</w:t>
             </w:r>
           </w:p>
         </w:tc>
@@ -2822,7 +2847,8 @@
               <w:jc w:val="left"/>
             </w:pPr>
             <w:r>
-              <w:t>幻影之刃</w:t>
+              <w:rPr/>
+              <w:t>Phantom Blade</w:t>
             </w:r>
           </w:p>
         </w:tc>
@@ -2887,7 +2913,8 @@
               <w:jc w:val="left"/>
             </w:pPr>
             <w:r>
-              <w:t>幻影连斩</w:t>
+              <w:rPr/>
+              <w:t>Phantom Slash</w:t>
             </w:r>
           </w:p>
         </w:tc>
@@ -2900,7 +2927,8 @@
               <w:jc w:val="left"/>
             </w:pPr>
             <w:r>
-              <w:t>3段连斩总计180%伤害</w:t>
+              <w:rPr/>
+              <w:t>3-hit combo, 180% total damage</w:t>
             </w:r>
           </w:p>
         </w:tc>
@@ -2915,7 +2943,8 @@
               <w:jc w:val="left"/>
             </w:pPr>
             <w:r>
-              <w:t>铁剑</w:t>
+              <w:rPr/>
+              <w:t>Iron Sword</w:t>
             </w:r>
           </w:p>
         </w:tc>
@@ -3008,7 +3037,8 @@
               <w:jc w:val="left"/>
             </w:pPr>
             <w:r>
-              <w:t>骑士剑</w:t>
+              <w:rPr/>
+              <w:t>Knight's Sword</w:t>
             </w:r>
           </w:p>
         </w:tc>
@@ -3101,7 +3131,8 @@
               <w:jc w:val="left"/>
             </w:pPr>
             <w:r>
-              <w:t>圣光剑</w:t>
+              <w:rPr/>
+              <w:t>Holy Light Sword</w:t>
             </w:r>
           </w:p>
         </w:tc>
@@ -3166,7 +3197,8 @@
               <w:jc w:val="left"/>
             </w:pPr>
             <w:r>
-              <w:t>圣光斩</w:t>
+              <w:rPr/>
+              <w:t>Holy Strike</w:t>
             </w:r>
           </w:p>
         </w:tc>
@@ -3179,7 +3211,8 @@
               <w:jc w:val="left"/>
             </w:pPr>
             <w:r>
-              <w:t>150%伤+30%真实+回复10%最大HP</w:t>
+              <w:rPr/>
+              <w:t>150% damage + 30% true + heals 10% max HP</w:t>
             </w:r>
           </w:p>
         </w:tc>
@@ -3194,7 +3227,8 @@
               <w:jc w:val="left"/>
             </w:pPr>
             <w:r>
-              <w:t>龙渊剑</w:t>
+              <w:rPr/>
+              <w:t>Dragon Abyss Sword</w:t>
             </w:r>
           </w:p>
         </w:tc>
@@ -3259,7 +3293,8 @@
               <w:jc w:val="left"/>
             </w:pPr>
             <w:r>
-              <w:t>龙渊斩波</w:t>
+              <w:rPr/>
+              <w:t>Abyss Wave</w:t>
             </w:r>
           </w:p>
         </w:tc>
@@ -3272,7 +3307,8 @@
               <w:jc w:val="left"/>
             </w:pPr>
             <w:r>
-              <w:t>前方扇形200%伤害</w:t>
+              <w:rPr/>
+              <w:t>200% damage in a forward cone</w:t>
             </w:r>
           </w:p>
         </w:tc>
@@ -3287,7 +3323,8 @@
               <w:jc w:val="left"/>
             </w:pPr>
             <w:r>
-              <w:t>铁矛大剑</w:t>
+              <w:rPr/>
+              <w:t>Iron Greatsword</w:t>
             </w:r>
           </w:p>
         </w:tc>
@@ -3380,7 +3417,8 @@
               <w:jc w:val="left"/>
             </w:pPr>
             <w:r>
-              <w:t>战士大剑</w:t>
+              <w:rPr/>
+              <w:t>Warrior's Greatsword</w:t>
             </w:r>
           </w:p>
         </w:tc>
@@ -3473,7 +3511,8 @@
               <w:jc w:val="left"/>
             </w:pPr>
             <w:r>
-              <w:t>破甲重剑</w:t>
+              <w:rPr/>
+              <w:t>Armor-Break Greatsword</w:t>
             </w:r>
           </w:p>
         </w:tc>
@@ -3538,7 +3577,8 @@
               <w:jc w:val="left"/>
             </w:pPr>
             <w:r>
-              <w:t>大地震荡</w:t>
+              <w:rPr/>
+              <w:t>Earth Shatter</w:t>
             </w:r>
           </w:p>
         </w:tc>
@@ -3551,7 +3591,8 @@
               <w:jc w:val="left"/>
             </w:pPr>
             <w:r>
-              <w:t>自身周围超大范围180%伤</w:t>
+              <w:rPr/>
+              <w:t>very large AoE around self, 180% damage</w:t>
             </w:r>
           </w:p>
         </w:tc>
@@ -3566,7 +3607,8 @@
               <w:jc w:val="left"/>
             </w:pPr>
             <w:r>
-              <w:t>末日巨剑</w:t>
+              <w:rPr/>
+              <w:t>Doomsday Greatsword</w:t>
             </w:r>
           </w:p>
         </w:tc>
@@ -3631,7 +3673,8 @@
               <w:jc w:val="left"/>
             </w:pPr>
             <w:r>
-              <w:t>毁灭天降</w:t>
+              <w:rPr/>
+              <w:t>Doom Fall</w:t>
             </w:r>
           </w:p>
         </w:tc>
@@ -3644,7 +3687,8 @@
               <w:jc w:val="left"/>
             </w:pPr>
             <w:r>
-              <w:t>全场所有敌人250%伤害</w:t>
+              <w:rPr/>
+              <w:t>250% damage to all enemies on screen</w:t>
             </w:r>
           </w:p>
         </w:tc>
@@ -3659,7 +3703,8 @@
               <w:jc w:val="left"/>
             </w:pPr>
             <w:r>
-              <w:t>木弓</w:t>
+              <w:rPr/>
+              <w:t>Wooden Bow</w:t>
             </w:r>
           </w:p>
         </w:tc>
@@ -3752,7 +3797,8 @@
               <w:jc w:val="left"/>
             </w:pPr>
             <w:r>
-              <w:t>猎人弓</w:t>
+              <w:rPr/>
+              <w:t>Hunter's Bow</w:t>
             </w:r>
           </w:p>
         </w:tc>
@@ -3845,7 +3891,8 @@
               <w:jc w:val="left"/>
             </w:pPr>
             <w:r>
-              <w:t>穿云弓</w:t>
+              <w:rPr/>
+              <w:t>Cloud-Piercer Bow</w:t>
             </w:r>
           </w:p>
         </w:tc>
@@ -3910,7 +3957,8 @@
               <w:jc w:val="left"/>
             </w:pPr>
             <w:r>
-              <w:t>穿云箭</w:t>
+              <w:rPr/>
+              <w:t>Piercing Arrow</w:t>
             </w:r>
           </w:p>
         </w:tc>
@@ -3923,7 +3971,8 @@
               <w:jc w:val="left"/>
             </w:pPr>
             <w:r>
-              <w:t>直线贯穿所有敌人150%伤</w:t>
+              <w:rPr/>
+              <w:t>pierces all enemies in a line, 150% damage</w:t>
             </w:r>
           </w:p>
         </w:tc>
@@ -3938,7 +3987,8 @@
               <w:jc w:val="left"/>
             </w:pPr>
             <w:r>
-              <w:t>天风弓</w:t>
+              <w:rPr/>
+              <w:t>Skywind Bow</w:t>
             </w:r>
           </w:p>
         </w:tc>
@@ -4003,7 +4053,8 @@
               <w:jc w:val="left"/>
             </w:pPr>
             <w:r>
-              <w:t>箭雨</w:t>
+              <w:rPr/>
+              <w:t>Rain of Arrows</w:t>
             </w:r>
           </w:p>
         </w:tc>
@@ -4016,7 +4067,8 @@
               <w:jc w:val="left"/>
             </w:pPr>
             <w:r>
-              <w:t>5支箭雨总计400%伤害</w:t>
+              <w:rPr/>
+              <w:t>volley of 5 arrows, 400% total damage</w:t>
             </w:r>
           </w:p>
         </w:tc>
@@ -4031,7 +4083,8 @@
               <w:jc w:val="left"/>
             </w:pPr>
             <w:r>
-              <w:t>木法杖</w:t>
+              <w:rPr/>
+              <w:t>Wooden Staff</w:t>
             </w:r>
           </w:p>
         </w:tc>
@@ -4109,7 +4162,8 @@
               <w:jc w:val="left"/>
             </w:pPr>
             <w:r>
-              <w:t>普攻在目标位置魔法爆炸</w:t>
+              <w:rPr/>
+              <w:t>normal attack: magic explosion at the target position</w:t>
             </w:r>
           </w:p>
         </w:tc>
@@ -4124,7 +4178,8 @@
               <w:jc w:val="left"/>
             </w:pPr>
             <w:r>
-              <w:t>魔法法杖</w:t>
+              <w:rPr/>
+              <w:t>Magic Staff</w:t>
             </w:r>
           </w:p>
         </w:tc>
@@ -4202,7 +4257,8 @@
               <w:jc w:val="left"/>
             </w:pPr>
             <w:r>
-              <w:t>更大爆炸范围</w:t>
+              <w:rPr/>
+              <w:t>larger explosion radius</w:t>
             </w:r>
           </w:p>
         </w:tc>
@@ -4217,7 +4273,8 @@
               <w:jc w:val="left"/>
             </w:pPr>
             <w:r>
-              <w:t>寒冰法杖</w:t>
+              <w:rPr/>
+              <w:t>Frost Staff</w:t>
             </w:r>
           </w:p>
         </w:tc>
@@ -4282,7 +4339,8 @@
               <w:jc w:val="left"/>
             </w:pPr>
             <w:r>
-              <w:t>冰霜新星</w:t>
+              <w:rPr/>
+              <w:t>Frost Nova</w:t>
             </w:r>
           </w:p>
         </w:tc>
@@ -4295,7 +4353,8 @@
               <w:jc w:val="left"/>
             </w:pPr>
             <w:r>
-              <w:t>自身为中心AOE 130%魔法伤</w:t>
+              <w:rPr/>
+              <w:t>AoE centered on self, 130% magic damage</w:t>
             </w:r>
           </w:p>
         </w:tc>
@@ -4310,7 +4369,8 @@
               <w:jc w:val="left"/>
             </w:pPr>
             <w:r>
-              <w:t>混沌魔杖</w:t>
+              <w:rPr/>
+              <w:t>Chaos Wand</w:t>
             </w:r>
           </w:p>
         </w:tc>
@@ -4375,7 +4435,8 @@
               <w:jc w:val="left"/>
             </w:pPr>
             <w:r>
-              <w:t>混沌爆发</w:t>
+              <w:rPr/>
+              <w:t>Chaos Burst</w:t>
             </w:r>
           </w:p>
         </w:tc>
@@ -4388,7 +4449,8 @@
               <w:jc w:val="left"/>
             </w:pPr>
             <w:r>
-              <w:t>目标位置220%伤+随机元素追伤</w:t>
+              <w:rPr/>
+              <w:t>220% damage at target + random elemental DoT</w:t>
             </w:r>
           </w:p>
         </w:tc>
@@ -4411,7 +4473,8 @@
         <w:pStyle w:val="ListBullet"/>
       </w:pPr>
       <w:r>
-        <w:t>Upgrade (升级): +damagePerLevel per level, max 5 levels. Available in Shop rooms.</w:t>
+        <w:rPr/>
+        <w:t>Upgrade: +damagePerLevel per level, max 5 levels. Available in Shop rooms.</w:t>
       </w:r>
     </w:p>
     <w:p>
@@ -4419,7 +4482,8 @@
         <w:pStyle w:val="ListBullet"/>
       </w:pPr>
       <w:r>
-        <w:t>Enchant (附魔): +10% skill multiplier per level, max 5 levels. Blue/Purple only. Available in Shop.</w:t>
+        <w:rPr/>
+        <w:t>Enchant: +10% skill multiplier per level, max 5 levels. Blue/Purple only. Available in Shop.</w:t>
       </w:r>
     </w:p>
     <w:p>
@@ -4845,7 +4909,8 @@
               <w:jc w:val="left"/>
             </w:pPr>
             <w:r>
-              <w:t>暴击强化 (Crit Boost)</w:t>
+              <w:rPr/>
+              <w:t>Crit Boost</w:t>
             </w:r>
           </w:p>
         </w:tc>
@@ -4886,7 +4951,8 @@
               <w:jc w:val="left"/>
             </w:pPr>
             <w:r>
-              <w:t>斩魂 (Soul Cleave)</w:t>
+              <w:rPr/>
+              <w:t>Soul Cleave</w:t>
             </w:r>
           </w:p>
         </w:tc>
@@ -4927,7 +4993,8 @@
               <w:jc w:val="left"/>
             </w:pPr>
             <w:r>
-              <w:t>战意 (Battle Fervor)</w:t>
+              <w:rPr/>
+              <w:t>Battle Fervor</w:t>
             </w:r>
           </w:p>
         </w:tc>
@@ -4968,7 +5035,8 @@
               <w:jc w:val="left"/>
             </w:pPr>
             <w:r>
-              <w:t>技能强化 (Skill Power)</w:t>
+              <w:rPr/>
+              <w:t>Skill Power</w:t>
             </w:r>
           </w:p>
         </w:tc>
@@ -5009,7 +5077,8 @@
               <w:jc w:val="left"/>
             </w:pPr>
             <w:r>
-              <w:t>冷却缩减 (CDR)</w:t>
+              <w:rPr/>
+              <w:t>CDR</w:t>
             </w:r>
           </w:p>
         </w:tc>
@@ -5050,7 +5119,8 @@
               <w:jc w:val="left"/>
             </w:pPr>
             <w:r>
-              <w:t>金币磁铁 (Coin Magnet)</w:t>
+              <w:rPr/>
+              <w:t>Coin Magnet</w:t>
             </w:r>
           </w:p>
         </w:tc>
@@ -5091,7 +5161,8 @@
               <w:jc w:val="left"/>
             </w:pPr>
             <w:r>
-              <w:t>吸血 (Lifesteal)</w:t>
+              <w:rPr/>
+              <w:t>Lifesteal</w:t>
             </w:r>
           </w:p>
         </w:tc>
@@ -5132,7 +5203,8 @@
               <w:jc w:val="left"/>
             </w:pPr>
             <w:r>
-              <w:t>无畏 (Fearless)</w:t>
+              <w:rPr/>
+              <w:t>Fearless</w:t>
             </w:r>
           </w:p>
         </w:tc>
@@ -5301,7 +5373,8 @@
               <w:jc w:val="left"/>
             </w:pPr>
             <w:r>
-              <w:t>战士本能 (Warrior's Instinct)</w:t>
+              <w:rPr/>
+              <w:t>Warrior's Instinct</w:t>
             </w:r>
           </w:p>
         </w:tc>
@@ -5329,7 +5402,8 @@
               <w:jc w:val="left"/>
             </w:pPr>
             <w:r>
-              <w:t>迅捷脚步 (Fleet-Footed)</w:t>
+              <w:rPr/>
+              <w:t>Fleet-Footed</w:t>
             </w:r>
           </w:p>
         </w:tc>
@@ -5357,7 +5431,8 @@
               <w:jc w:val="left"/>
             </w:pPr>
             <w:r>
-              <w:t>技能加速 (Skill Acceleration)</w:t>
+              <w:rPr/>
+              <w:t>Skill Acceleration</w:t>
             </w:r>
           </w:p>
         </w:tc>
@@ -5385,7 +5460,8 @@
               <w:jc w:val="left"/>
             </w:pPr>
             <w:r>
-              <w:t>金币暴涨 (Coin Surge)</w:t>
+              <w:rPr/>
+              <w:t>Coin Surge</w:t>
             </w:r>
           </w:p>
         </w:tc>
@@ -5413,7 +5489,8 @@
               <w:jc w:val="left"/>
             </w:pPr>
             <w:r>
-              <w:t>强韧 (Fortitude)</w:t>
+              <w:rPr/>
+              <w:t>Fortitude</w:t>
             </w:r>
           </w:p>
         </w:tc>
@@ -5441,7 +5518,8 @@
               <w:jc w:val="left"/>
             </w:pPr>
             <w:r>
-              <w:t>精准打击 (Precision Strike)</w:t>
+              <w:rPr/>
+              <w:t>Precision Strike</w:t>
             </w:r>
           </w:p>
         </w:tc>
@@ -5549,7 +5627,8 @@
               <w:jc w:val="left"/>
             </w:pPr>
             <w:r>
-              <w:t>虚弱 (Weakness)</w:t>
+              <w:rPr/>
+              <w:t>Weakness</w:t>
             </w:r>
           </w:p>
         </w:tc>
@@ -5590,7 +5669,8 @@
               <w:jc w:val="left"/>
             </w:pPr>
             <w:r>
-              <w:t>笨重 (Sluggish)</w:t>
+              <w:rPr/>
+              <w:t>Sluggish</w:t>
             </w:r>
           </w:p>
         </w:tc>
@@ -5631,7 +5711,8 @@
               <w:jc w:val="left"/>
             </w:pPr>
             <w:r>
-              <w:t>诅咒武器 (Cursed Arm)</w:t>
+              <w:rPr/>
+              <w:t>Cursed Arm</w:t>
             </w:r>
           </w:p>
         </w:tc>
@@ -5672,7 +5753,8 @@
               <w:jc w:val="left"/>
             </w:pPr>
             <w:r>
-              <w:t>血量枷锁 (HP Lock)</w:t>
+              <w:rPr/>
+              <w:t>HP Lock</w:t>
             </w:r>
           </w:p>
         </w:tc>
@@ -5713,7 +5795,8 @@
               <w:jc w:val="left"/>
             </w:pPr>
             <w:r>
-              <w:t>金币诅咒 (Coin Curse)</w:t>
+              <w:rPr/>
+              <w:t>Coin Curse</w:t>
             </w:r>
           </w:p>
         </w:tc>
@@ -6192,7 +6275,8 @@
               <w:jc w:val="left"/>
             </w:pPr>
             <w:r>
-              <w:t>骷髅怪 Skeleton</w:t>
+              <w:rPr/>
+              <w:t>Skeleton</w:t>
             </w:r>
           </w:p>
         </w:tc>
@@ -6285,7 +6369,8 @@
               <w:jc w:val="left"/>
             </w:pPr>
             <w:r>
-              <w:t>腐败小兵 Soldier</w:t>
+              <w:rPr/>
+              <w:t>Soldier</w:t>
             </w:r>
           </w:p>
         </w:tc>
@@ -6378,7 +6463,8 @@
               <w:jc w:val="left"/>
             </w:pPr>
             <w:r>
-              <w:t>腐败弓箭手 Archer</w:t>
+              <w:rPr/>
+              <w:t>Archer</w:t>
             </w:r>
           </w:p>
         </w:tc>
@@ -6471,7 +6557,8 @@
               <w:jc w:val="left"/>
             </w:pPr>
             <w:r>
-              <w:t>飞天蝙蝠 Bat</w:t>
+              <w:rPr/>
+              <w:t>Bat</w:t>
             </w:r>
           </w:p>
         </w:tc>
@@ -6564,7 +6651,8 @@
               <w:jc w:val="left"/>
             </w:pPr>
             <w:r>
-              <w:t>腐败盾士 ShieldGuard</w:t>
+              <w:rPr/>
+              <w:t>ShieldGuard</w:t>
             </w:r>
           </w:p>
         </w:tc>
@@ -6794,7 +6882,8 @@
               <w:jc w:val="left"/>
             </w:pPr>
             <w:r>
-              <w:t>腐败士官 Commander</w:t>
+              <w:rPr/>
+              <w:t>Commander</w:t>
             </w:r>
           </w:p>
         </w:tc>
@@ -6846,7 +6935,8 @@
               <w:jc w:val="left"/>
             </w:pPr>
             <w:r>
-              <w:t>AOE双手剑攻击 (range 2.2 m, every 2 s) + 光环强化 (每10s：附近敌人HP+50%,ATK+30%, 持续8s)</w:t>
+              <w:rPr/>
+              <w:t>AoE greatsword attack (range 2.2 m, every 2 s) + Aura buff (every 10 s: nearby enemies +50% HP, +30% ATK for 8 s)</w:t>
             </w:r>
           </w:p>
         </w:tc>
@@ -6874,7 +6964,8 @@
               <w:jc w:val="left"/>
             </w:pPr>
             <w:r>
-              <w:t>女巫 Witch</w:t>
+              <w:rPr/>
+              <w:t>Witch</w:t>
             </w:r>
           </w:p>
         </w:tc>
@@ -6926,7 +7017,8 @@
               <w:jc w:val="left"/>
             </w:pPr>
             <w:r>
-              <w:t>远程法杖攻击 (range 8 m) + 每8s召唤2只飞天蝙蝠</w:t>
+              <w:rPr/>
+              <w:t>Ranged staff attack (range 8 m) + summons 2 Bats every 8 s</w:t>
             </w:r>
           </w:p>
         </w:tc>
@@ -6954,7 +7046,7 @@
         <w:rPr>
           <w:color w:val="2E74B5"/>
         </w:rPr>
-        <w:t>6.4 Boss — 地狱巨人 Hell Giant</w:t>
+        <w:t>6.4 Boss — Hell Giant</w:t>
       </w:r>
     </w:p>
     <w:tbl>
@@ -7412,7 +7504,8 @@
               <w:jc w:val="left"/>
             </w:pPr>
             <w:r>
-              <w:t>地狱巨人 Hell Giant (current)</w:t>
+              <w:rPr/>
+              <w:t>Hell Giant (current)</w:t>
             </w:r>
           </w:p>
         </w:tc>
@@ -7466,7 +7559,8 @@
               <w:jc w:val="left"/>
             </w:pPr>
             <w:r>
-              <w:t>冰霜女王 Frost Queen (planned)</w:t>
+              <w:rPr/>
+              <w:t>Frost Queen (planned)</w:t>
             </w:r>
           </w:p>
         </w:tc>
@@ -7520,7 +7614,8 @@
               <w:jc w:val="left"/>
             </w:pPr>
             <w:r>
-              <w:t>虚空君主 Void Tyrant (planned)</w:t>
+              <w:rPr/>
+              <w:t>Void Tyrant (planned)</w:t>
             </w:r>
           </w:p>
         </w:tc>
@@ -10651,7 +10746,8 @@
         <w:pStyle w:val="ListBullet"/>
       </w:pPr>
       <w:r>
-        <w:t>Row 3: HP: current / max   金币: N</w:t>
+        <w:rPr/>
+        <w:t>Row 3: HP: current / max Coins: N</w:t>
       </w:r>
     </w:p>
     <w:p>
@@ -10694,7 +10790,8 @@
         <w:pStyle w:val="ListBullet"/>
       </w:pPr>
       <w:r>
-        <w:t>Dark overlay. 'Floor N 清除！' title in green.</w:t>
+        <w:rPr/>
+        <w:t>Dark overlay. 'Floor N Cleared!' title in green.</w:t>
       </w:r>
     </w:p>
     <w:p>
@@ -15456,7 +15553,8 @@
               <w:jc w:val="left"/>
             </w:pPr>
             <w:r>
-              <w:t>Poison 中毒</w:t>
+              <w:rPr/>
+              <w:t>Poison</w:t>
             </w:r>
           </w:p>
         </w:tc>
@@ -15523,7 +15621,8 @@
               <w:jc w:val="left"/>
             </w:pPr>
             <w:r>
-              <w:t>Freeze 冰冻</w:t>
+              <w:rPr/>
+              <w:t>Freeze</w:t>
             </w:r>
           </w:p>
         </w:tc>
@@ -15590,7 +15689,8 @@
               <w:jc w:val="left"/>
             </w:pPr>
             <w:r>
-              <w:t>Burn 燃烧</w:t>
+              <w:rPr/>
+              <w:t>Burn</w:t>
             </w:r>
           </w:p>
         </w:tc>
@@ -15657,7 +15757,8 @@
               <w:jc w:val="left"/>
             </w:pPr>
             <w:r>
-              <w:t>Shock 感电</w:t>
+              <w:rPr/>
+              <w:t>Shock</w:t>
             </w:r>
           </w:p>
         </w:tc>
@@ -15724,7 +15825,8 @@
               <w:jc w:val="left"/>
             </w:pPr>
             <w:r>
-              <w:t>Frailty 脆弱</w:t>
+              <w:rPr/>
+              <w:t>Frailty</w:t>
             </w:r>
           </w:p>
         </w:tc>
@@ -15967,7 +16069,8 @@
               <w:jc w:val="left"/>
             </w:pPr>
             <w:r>
-              <w:t>毒牙</w:t>
+              <w:rPr/>
+              <w:t>Venom Fang</w:t>
             </w:r>
           </w:p>
         </w:tc>
@@ -15980,7 +16083,8 @@
               <w:jc w:val="left"/>
             </w:pPr>
             <w:r>
-              <w:t>毒液喷射</w:t>
+              <w:rPr/>
+              <w:t>Venom Spray</w:t>
             </w:r>
           </w:p>
         </w:tc>
@@ -16058,7 +16162,8 @@
               <w:jc w:val="left"/>
             </w:pPr>
             <w:r>
-              <w:t>AoE前方+40%真实毒素追伤</w:t>
+              <w:rPr/>
+              <w:t>AoE forward + 40% true poison DoT</w:t>
             </w:r>
           </w:p>
         </w:tc>
@@ -16073,7 +16178,8 @@
               <w:jc w:val="left"/>
             </w:pPr>
             <w:r>
-              <w:t>幻影之刃</w:t>
+              <w:rPr/>
+              <w:t>Phantom Blade</w:t>
             </w:r>
           </w:p>
         </w:tc>
@@ -16086,7 +16192,8 @@
               <w:jc w:val="left"/>
             </w:pPr>
             <w:r>
-              <w:t>幻影连斩</w:t>
+              <w:rPr/>
+              <w:t>Phantom Slash</w:t>
             </w:r>
           </w:p>
         </w:tc>
@@ -16164,7 +16271,8 @@
               <w:jc w:val="left"/>
             </w:pPr>
             <w:r>
-              <w:t>3段连斩各60%伤</w:t>
+              <w:rPr/>
+              <w:t>3-hit combo, 60% damage each</w:t>
             </w:r>
           </w:p>
         </w:tc>
@@ -16179,7 +16287,8 @@
               <w:jc w:val="left"/>
             </w:pPr>
             <w:r>
-              <w:t>圣光剑</w:t>
+              <w:rPr/>
+              <w:t>Holy Light Sword</w:t>
             </w:r>
           </w:p>
         </w:tc>
@@ -16192,7 +16301,8 @@
               <w:jc w:val="left"/>
             </w:pPr>
             <w:r>
-              <w:t>圣光斩</w:t>
+              <w:rPr/>
+              <w:t>Holy Strike</w:t>
             </w:r>
           </w:p>
         </w:tc>
@@ -16270,7 +16380,8 @@
               <w:jc w:val="left"/>
             </w:pPr>
             <w:r>
-              <w:t>+30%真实+回10%HP</w:t>
+              <w:rPr/>
+              <w:t>+30% true + heals 10% HP</w:t>
             </w:r>
           </w:p>
         </w:tc>
@@ -16285,7 +16396,8 @@
               <w:jc w:val="left"/>
             </w:pPr>
             <w:r>
-              <w:t>龙渊剑</w:t>
+              <w:rPr/>
+              <w:t>Dragon Abyss Sword</w:t>
             </w:r>
           </w:p>
         </w:tc>
@@ -16298,7 +16410,8 @@
               <w:jc w:val="left"/>
             </w:pPr>
             <w:r>
-              <w:t>龙渊斩波</w:t>
+              <w:rPr/>
+              <w:t>Abyss Wave</w:t>
             </w:r>
           </w:p>
         </w:tc>
@@ -16376,7 +16489,8 @@
               <w:jc w:val="left"/>
             </w:pPr>
             <w:r>
-              <w:t>前方扇形</w:t>
+              <w:rPr/>
+              <w:t>forward cone</w:t>
             </w:r>
           </w:p>
         </w:tc>
@@ -16391,7 +16505,8 @@
               <w:jc w:val="left"/>
             </w:pPr>
             <w:r>
-              <w:t>破甲重剑</w:t>
+              <w:rPr/>
+              <w:t>Armor-Break Greatsword</w:t>
             </w:r>
           </w:p>
         </w:tc>
@@ -16404,7 +16519,8 @@
               <w:jc w:val="left"/>
             </w:pPr>
             <w:r>
-              <w:t>大地震荡</w:t>
+              <w:rPr/>
+              <w:t>Earth Shatter</w:t>
             </w:r>
           </w:p>
         </w:tc>
@@ -16482,7 +16598,8 @@
               <w:jc w:val="left"/>
             </w:pPr>
             <w:r>
-              <w:t>自身周围超大AOE</w:t>
+              <w:rPr/>
+              <w:t>very large AoE around self</w:t>
             </w:r>
           </w:p>
         </w:tc>
@@ -16497,7 +16614,8 @@
               <w:jc w:val="left"/>
             </w:pPr>
             <w:r>
-              <w:t>末日巨剑</w:t>
+              <w:rPr/>
+              <w:t>Doomsday Greatsword</w:t>
             </w:r>
           </w:p>
         </w:tc>
@@ -16510,7 +16628,8 @@
               <w:jc w:val="left"/>
             </w:pPr>
             <w:r>
-              <w:t>毁灭天降</w:t>
+              <w:rPr/>
+              <w:t>Doom Fall</w:t>
             </w:r>
           </w:p>
         </w:tc>
@@ -16588,7 +16707,8 @@
               <w:jc w:val="left"/>
             </w:pPr>
             <w:r>
-              <w:t>全场所有敌人</w:t>
+              <w:rPr/>
+              <w:t>all enemies on screen</w:t>
             </w:r>
           </w:p>
         </w:tc>
@@ -16603,7 +16723,8 @@
               <w:jc w:val="left"/>
             </w:pPr>
             <w:r>
-              <w:t>穿云弓</w:t>
+              <w:rPr/>
+              <w:t>Cloud-Piercer Bow</w:t>
             </w:r>
           </w:p>
         </w:tc>
@@ -16616,7 +16737,8 @@
               <w:jc w:val="left"/>
             </w:pPr>
             <w:r>
-              <w:t>穿云箭</w:t>
+              <w:rPr/>
+              <w:t>Piercing Arrow</w:t>
             </w:r>
           </w:p>
         </w:tc>
@@ -16694,7 +16816,8 @@
               <w:jc w:val="left"/>
             </w:pPr>
             <w:r>
-              <w:t>直线贯穿所有敌人</w:t>
+              <w:rPr/>
+              <w:t>pierces all enemies in a line</w:t>
             </w:r>
           </w:p>
         </w:tc>
@@ -16709,7 +16832,8 @@
               <w:jc w:val="left"/>
             </w:pPr>
             <w:r>
-              <w:t>天风弓</w:t>
+              <w:rPr/>
+              <w:t>Skywind Bow</w:t>
             </w:r>
           </w:p>
         </w:tc>
@@ -16722,7 +16846,8 @@
               <w:jc w:val="left"/>
             </w:pPr>
             <w:r>
-              <w:t>箭雨</w:t>
+              <w:rPr/>
+              <w:t>Rain of Arrows</w:t>
             </w:r>
           </w:p>
         </w:tc>
@@ -16800,7 +16925,8 @@
               <w:jc w:val="left"/>
             </w:pPr>
             <w:r>
-              <w:t>5箭各80%伤</w:t>
+              <w:rPr/>
+              <w:t>5 arrows, 80% damage each</w:t>
             </w:r>
           </w:p>
         </w:tc>
@@ -16815,7 +16941,8 @@
               <w:jc w:val="left"/>
             </w:pPr>
             <w:r>
-              <w:t>寒冰法杖</w:t>
+              <w:rPr/>
+              <w:t>Frost Staff</w:t>
             </w:r>
           </w:p>
         </w:tc>
@@ -16828,7 +16955,8 @@
               <w:jc w:val="left"/>
             </w:pPr>
             <w:r>
-              <w:t>冰霜新星</w:t>
+              <w:rPr/>
+              <w:t>Frost Nova</w:t>
             </w:r>
           </w:p>
         </w:tc>
@@ -16906,7 +17034,8 @@
               <w:jc w:val="left"/>
             </w:pPr>
             <w:r>
-              <w:t>自身为中心AOE+冰冻追伤</w:t>
+              <w:rPr/>
+              <w:t>AoE centered on self + freeze DoT</w:t>
             </w:r>
           </w:p>
         </w:tc>
@@ -16921,7 +17050,8 @@
               <w:jc w:val="left"/>
             </w:pPr>
             <w:r>
-              <w:t>混沌魔杖</w:t>
+              <w:rPr/>
+              <w:t>Chaos Wand</w:t>
             </w:r>
           </w:p>
         </w:tc>
@@ -16934,7 +17064,8 @@
               <w:jc w:val="left"/>
             </w:pPr>
             <w:r>
-              <w:t>混沌爆发</w:t>
+              <w:rPr/>
+              <w:t>Chaos Burst</w:t>
             </w:r>
           </w:p>
         </w:tc>
@@ -17012,13 +17143,351 @@
               <w:jc w:val="left"/>
             </w:pPr>
             <w:r>
-              <w:t>随机元素追伤</w:t>
+              <w:rPr/>
+              <w:t>random elemental DoT</w:t>
             </w:r>
           </w:p>
         </w:tc>
       </w:tr>
     </w:tbl>
     <w:p/>
+    <w:p>
+      <w:r>
+        <w:br w:type="page"/>
+      </w:r>
+    </w:p>
+    <w:p>
+      <w:pPr>
+        <w:pStyle w:val="Heading1"/>
+      </w:pPr>
+      <w:r>
+        <w:t>Addendum — Design Evolution: From This GDD to the Final Build</w:t>
+      </w:r>
+    </w:p>
+    <w:p>
+      <w:r>
+        <w:t>This document captured the design at an early stage (v0.4, “Prototype Complete”). The project continued to evolve substantially during development, and the shipped game — Embers of the Three Realms — differs from the plan above in several deliberate ways. This addendum records what changed and why, so that this GDD and the final build can be read together.</w:t>
+      </w:r>
+    </w:p>
+    <w:tbl>
+      <w:tblPr>
+        <w:tblStyle w:val="TableGrid"/>
+        <w:tblW w:type="auto" w:w="0"/>
+        <w:tblLook w:firstColumn="1" w:firstRow="1" w:lastColumn="0" w:lastRow="0" w:noHBand="0" w:noVBand="1" w:val="04A0"/>
+      </w:tblPr>
+      <w:tblGrid>
+        <w:gridCol w:w="3135"/>
+        <w:gridCol w:w="3135"/>
+        <w:gridCol w:w="3135"/>
+      </w:tblGrid>
+      <w:tr>
+        <w:tc>
+          <w:tcPr>
+            <w:tcW w:type="dxa" w:w="3135"/>
+          </w:tcPr>
+          <w:p>
+            <w:r>
+              <w:rPr>
+                <w:b/>
+              </w:rPr>
+              <w:t>Aspect</w:t>
+            </w:r>
+          </w:p>
+        </w:tc>
+        <w:tc>
+          <w:tcPr>
+            <w:tcW w:type="dxa" w:w="3135"/>
+          </w:tcPr>
+          <w:p>
+            <w:r>
+              <w:rPr>
+                <w:b/>
+              </w:rPr>
+              <w:t>As planned in this GDD</w:t>
+            </w:r>
+          </w:p>
+        </w:tc>
+        <w:tc>
+          <w:tcPr>
+            <w:tcW w:type="dxa" w:w="3135"/>
+          </w:tcPr>
+          <w:p>
+            <w:r>
+              <w:rPr>
+                <w:b/>
+              </w:rPr>
+              <w:t>In the final build</w:t>
+            </w:r>
+          </w:p>
+        </w:tc>
+      </w:tr>
+      <w:tr>
+        <w:tc>
+          <w:tcPr>
+            <w:tcW w:type="dxa" w:w="3135"/>
+          </w:tcPr>
+          <w:p>
+            <w:r>
+              <w:t>Identity &amp; fiction</w:t>
+            </w:r>
+          </w:p>
+        </w:tc>
+        <w:tc>
+          <w:tcPr>
+            <w:tcW w:type="dxa" w:w="3135"/>
+          </w:tcPr>
+          <w:p>
+            <w:r>
+              <w:t>Generic 2D anime roguelike; menu-based hero select</w:t>
+            </w:r>
+          </w:p>
+        </w:tc>
+        <w:tc>
+          <w:tcPr>
+            <w:tcW w:type="dxa" w:w="3135"/>
+          </w:tcPr>
+          <w:p>
+            <w:r>
+              <w:t>Narrative-driven: a nameless ember possessing fallen heroes across three collapsing realms, with a branching truth, multiple endings, and a hidden final boss (Kingdom’s Guilt)</w:t>
+            </w:r>
+          </w:p>
+        </w:tc>
+      </w:tr>
+      <w:tr>
+        <w:tc>
+          <w:tcPr>
+            <w:tcW w:type="dxa" w:w="3135"/>
+          </w:tcPr>
+          <w:p>
+            <w:r>
+              <w:t>Hero selection</w:t>
+            </w:r>
+          </w:p>
+        </w:tc>
+        <w:tc>
+          <w:tcPr>
+            <w:tcW w:type="dxa" w:w="3135"/>
+          </w:tcPr>
+          <w:p>
+            <w:r>
+              <w:t>Main-menu hero cards</w:t>
+            </w:r>
+          </w:p>
+        </w:tc>
+        <w:tc>
+          <w:tcPr>
+            <w:tcW w:type="dxa" w:w="3135"/>
+          </w:tcPr>
+          <w:p>
+            <w:r>
+              <w:t>Diegetic — the player walks to a fallen hero’s pedestal in a camp and possesses it</w:t>
+            </w:r>
+          </w:p>
+        </w:tc>
+      </w:tr>
+      <w:tr>
+        <w:tc>
+          <w:tcPr>
+            <w:tcW w:type="dxa" w:w="3135"/>
+          </w:tcPr>
+          <w:p>
+            <w:r>
+              <w:t>Art</w:t>
+            </w:r>
+          </w:p>
+        </w:tc>
+        <w:tc>
+          <w:tcPr>
+            <w:tcW w:type="dxa" w:w="3135"/>
+          </w:tcPr>
+          <w:p>
+            <w:r>
+              <w:t>3D models in Blender rendered to anime sprite sheets</w:t>
+            </w:r>
+          </w:p>
+        </w:tc>
+        <w:tc>
+          <w:tcPr>
+            <w:tcW w:type="dxa" w:w="3135"/>
+          </w:tcPr>
+          <w:p>
+            <w:r>
+              <w:t>Curated third-party 2D pixel art used under open licences (CC0 / CC-BY-SA 3.0 / OFL)</w:t>
+            </w:r>
+          </w:p>
+        </w:tc>
+      </w:tr>
+      <w:tr>
+        <w:tc>
+          <w:tcPr>
+            <w:tcW w:type="dxa" w:w="3135"/>
+          </w:tcPr>
+          <w:p>
+            <w:r>
+              <w:t>Scene structure</w:t>
+            </w:r>
+          </w:p>
+        </w:tc>
+        <w:tc>
+          <w:tcPr>
+            <w:tcW w:type="dxa" w:w="3135"/>
+          </w:tcPr>
+          <w:p>
+            <w:r>
+              <w:t>A single-scene runtime state machine</w:t>
+            </w:r>
+          </w:p>
+        </w:tc>
+        <w:tc>
+          <w:tcPr>
+            <w:tcW w:type="dxa" w:w="3135"/>
+          </w:tcPr>
+          <w:p>
+            <w:r>
+              <w:t>Multiple scenes — Title, Hub (camp), Dungeon, Training</w:t>
+            </w:r>
+          </w:p>
+        </w:tc>
+      </w:tr>
+      <w:tr>
+        <w:tc>
+          <w:tcPr>
+            <w:tcW w:type="dxa" w:w="3135"/>
+          </w:tcPr>
+          <w:p>
+            <w:r>
+              <w:t>Bosses</w:t>
+            </w:r>
+          </w:p>
+        </w:tc>
+        <w:tc>
+          <w:tcPr>
+            <w:tcW w:type="dxa" w:w="3135"/>
+          </w:tcPr>
+          <w:p>
+            <w:r>
+              <w:t>One Hell Giant reused on every floor</w:t>
+            </w:r>
+          </w:p>
+        </w:tc>
+        <w:tc>
+          <w:tcPr>
+            <w:tcW w:type="dxa" w:w="3135"/>
+          </w:tcPr>
+          <w:p>
+            <w:r>
+              <w:t>Floor-appropriate bosses plus the hidden finale</w:t>
+            </w:r>
+          </w:p>
+        </w:tc>
+      </w:tr>
+      <w:tr>
+        <w:tc>
+          <w:tcPr>
+            <w:tcW w:type="dxa" w:w="3135"/>
+          </w:tcPr>
+          <w:p>
+            <w:r>
+              <w:t>Audio, hero skills, pause menu</w:t>
+            </w:r>
+          </w:p>
+        </w:tc>
+        <w:tc>
+          <w:tcPr>
+            <w:tcW w:type="dxa" w:w="3135"/>
+          </w:tcPr>
+          <w:p>
+            <w:r>
+              <w:t>Planned / not implemented</w:t>
+            </w:r>
+          </w:p>
+        </w:tc>
+        <w:tc>
+          <w:tcPr>
+            <w:tcW w:type="dxa" w:w="3135"/>
+          </w:tcPr>
+          <w:p>
+            <w:r>
+              <w:t>Delivered: combat SFX + per-floor BGM, hero active skills, and a shared Esc pause menu with volume settings</w:t>
+            </w:r>
+          </w:p>
+        </w:tc>
+      </w:tr>
+      <w:tr>
+        <w:tc>
+          <w:tcPr>
+            <w:tcW w:type="dxa" w:w="3135"/>
+          </w:tcPr>
+          <w:p>
+            <w:r>
+              <w:t>Training</w:t>
+            </w:r>
+          </w:p>
+        </w:tc>
+        <w:tc>
+          <w:tcPr>
+            <w:tcW w:type="dxa" w:w="3135"/>
+          </w:tcPr>
+          <w:p>
+            <w:r>
+              <w:t>Not in this GDD</w:t>
+            </w:r>
+          </w:p>
+        </w:tc>
+        <w:tc>
+          <w:tcPr>
+            <w:tcW w:type="dxa" w:w="3135"/>
+          </w:tcPr>
+          <w:p>
+            <w:r>
+              <w:t>A training arena to try a hero’s weapons and skills before a run</w:t>
+            </w:r>
+          </w:p>
+        </w:tc>
+      </w:tr>
+      <w:tr>
+        <w:tc>
+          <w:tcPr>
+            <w:tcW w:type="dxa" w:w="3135"/>
+          </w:tcPr>
+          <w:p>
+            <w:r>
+              <w:t>UI technology</w:t>
+            </w:r>
+          </w:p>
+        </w:tc>
+        <w:tc>
+          <w:tcPr>
+            <w:tcW w:type="dxa" w:w="3135"/>
+          </w:tcPr>
+          <w:p>
+            <w:r>
+              <w:t>Immediate-mode GUI in the prototype</w:t>
+            </w:r>
+          </w:p>
+        </w:tc>
+        <w:tc>
+          <w:tcPr>
+            <w:tcW w:type="dxa" w:w="3135"/>
+          </w:tcPr>
+          <w:p>
+            <w:r>
+              <w:t>Migrated to retained-mode uGUI (Canvas) for cleaner layout and performance</w:t>
+            </w:r>
+          </w:p>
+        </w:tc>
+      </w:tr>
+    </w:tbl>
+    <w:p>
+      <w:r>
+        <w:t>Two decisions drove the change. First, the original premise was thin, so the project gained a narrative identity — the ember, the possession mechanic and the three-realm descent — which turned a set of systems into a game with a clear purpose and replay value. Second, the planned Blender-to-anime art pipeline was not achievable for a single developer in the available time, so the art direction shifted to sourcing and integrating licensed pixel art. Choosing a smaller, finishable art plan over an ambitious one that would never ship was a deliberate scope decision.</w:t>
+      </w:r>
+    </w:p>
+    <w:p>
+      <w:r>
+        <w:t>Some features above remained out of scope for the vertical slice and are recorded here as future work rather than delivered content: the full positive/negative buff system, some hero passives, the shop’s weapon-sale and upgrade UI, controller and mobile/touch support, and sprite-sheet animation. The mechanical skeleton of this GDD — the run structure, dual weapon slots, talents, the stat-modifier stack, per-floor scaling and persistent unlocks — carried through to the final build.</w:t>
+      </w:r>
+    </w:p>
     <w:sectPr>
       <w:pgSz w:w="12240" w:h="15840"/>
       <w:pgMar w:top="1134" w:right="1417" w:bottom="1134" w:left="1417" w:header="720" w:footer="720" w:gutter="0"/>
@@ -40928,8 +41397,8 @@
         <a:cs typeface=""/>
         <a:font script="Jpan" typeface="ＭＳ ゴシック"/>
         <a:font script="Hang" typeface="맑은 고딕"/>
-        <a:font script="Hans" typeface="宋体"/>
-        <a:font script="Hant" typeface="新細明體"/>
+        <a:font script="Hans" typeface="Calibri"/>
+        <a:font script="Hant" typeface="Calibri"/>
         <a:font script="Arab" typeface="Times New Roman"/>
         <a:font script="Hebr" typeface="Times New Roman"/>
         <a:font script="Thai" typeface="Angsana New"/>
@@ -40961,10 +41430,10 @@
         <a:latin typeface="Cambria"/>
         <a:ea typeface=""/>
         <a:cs typeface=""/>
-        <a:font script="Jpan" typeface="ＭＳ 明朝"/>
+        <a:font script="Jpan" typeface="ＭＳ Calibri"/>
         <a:font script="Hang" typeface="맑은 고딕"/>
-        <a:font script="Hans" typeface="宋体"/>
-        <a:font script="Hant" typeface="新細明體"/>
+        <a:font script="Hans" typeface="Calibri"/>
+        <a:font script="Hant" typeface="Calibri"/>
         <a:font script="Arab" typeface="Arial"/>
         <a:font script="Hebr" typeface="Arial"/>
         <a:font script="Thai" typeface="Cordia New"/>

</xml_diff>

<commit_message>
GDD: add Concept & Design summary covering all 15 brief requirements
</commit_message>
<xml_diff>
--- a/GDD.docx
+++ b/GDD.docx
@@ -24,7 +24,7 @@
           <w:color w:val="2E74B5"/>
           <w:sz w:val="44"/>
         </w:rPr>
-        <w:t>2D Anime Roguelike Action Game</w:t>
+        <w:t>Embers of the Three Realms</w:t>
       </w:r>
     </w:p>
     <w:p/>
@@ -59,6 +59,517 @@
         <w:pStyle w:val="Heading1"/>
       </w:pPr>
       <w:r>
+        <w:t>Concept &amp; Design Summary</w:t>
+      </w:r>
+    </w:p>
+    <w:p>
+      <w:r>
+        <w:t xml:space="preserve">This summary addresses each required element of the Game Concept and Design brief; where a point is expanded later, the relevant section is referenced. The project began as a generic prototype and grew into </w:t>
+      </w:r>
+      <w:r>
+        <w:rPr>
+          <w:i/>
+        </w:rPr>
+        <w:t>Embers of the Three Realms</w:t>
+      </w:r>
+      <w:r>
+        <w:t xml:space="preserve"> — see the Design Evolution addendum for the full before/after.</w:t>
+      </w:r>
+    </w:p>
+    <w:p>
+      <w:r>
+        <w:rPr>
+          <w:b/>
+        </w:rPr>
+        <w:t>1. Game title.</w:t>
+      </w:r>
+      <w:r>
+        <w:t xml:space="preserve"> Embers of the Three Realms (the prototype name '2D Anime Roguelike Action Game' still appears in a few legacy sections).</w:t>
+      </w:r>
+    </w:p>
+    <w:p>
+      <w:r>
+        <w:rPr>
+          <w:b/>
+        </w:rPr>
+        <w:t>2. One-sentence game idea.</w:t>
+      </w:r>
+      <w:r>
+        <w:t xml:space="preserve"> A narrative roguelike in which a nameless ember possesses fallen heroes to descend through three collapsing realms and uncover a buried truth — one run at a time.</w:t>
+      </w:r>
+    </w:p>
+    <w:p>
+      <w:r>
+        <w:rPr>
+          <w:b/>
+        </w:rPr>
+        <w:t>3. Intended player experience.</w:t>
+      </w:r>
+      <w:r>
+        <w:t xml:space="preserve"> Fast, fair, replayable runs: each attempt feels fresh, build choices matter, difficulty escalates to reward mastery, and a branching story gives a reason to replay (see Section 1 'Core Experience' and Section 15 'Balance').</w:t>
+      </w:r>
+    </w:p>
+    <w:p>
+      <w:r>
+        <w:rPr>
+          <w:b/>
+        </w:rPr>
+        <w:t>4. Core mechanic.</w:t>
+      </w:r>
+      <w:r>
+        <w:t xml:space="preserve"> A roguelike run built on possession and build-crafting: possess a hero, then assemble a run from two weapons, 1-of-3 talent picks and shop upgrades; all in-run power is lost on death, and only hero and story unlocks persist.</w:t>
+      </w:r>
+    </w:p>
+    <w:p>
+      <w:r>
+        <w:rPr>
+          <w:b/>
+        </w:rPr>
+        <w:t>5. What the player does moment to moment.</w:t>
+      </w:r>
+      <w:r>
+        <w:t xml:space="preserve"> Move (WASD) and aim (mouse); clear enemy waves with normal attacks (Space/LMB) and weapon skills (R/RMB); swap weapons (Q) and use a hero skill (F); choose 1 of 3 talents between rooms; press E to interact at shops, story objects and the exit door (see Sections 7 and 9).</w:t>
+      </w:r>
+    </w:p>
+    <w:p>
+      <w:r>
+        <w:rPr>
+          <w:b/>
+        </w:rPr>
+        <w:t>6. Target player.</w:t>
+      </w:r>
+      <w:r>
+        <w:t xml:space="preserve"> PC players who enjoy roguelikes and top-down action — build variety, short repeatable sessions and a light narrative hook (see Section 1).</w:t>
+      </w:r>
+    </w:p>
+    <w:p>
+      <w:r>
+        <w:rPr>
+          <w:b/>
+        </w:rPr>
+        <w:t>7. Reference games / inspirations.</w:t>
+      </w:r>
+      <w:r>
+        <w:t xml:space="preserve"> Hades (Supergiant Games) for run structure, hero skills and narrative-through-replay; The Binding of Isaac for room-based runs and build variety; top-down action roguelites such as Soul Knight for moment-to-moment combat feel.</w:t>
+      </w:r>
+    </w:p>
+    <w:p>
+      <w:r>
+        <w:rPr>
+          <w:b/>
+        </w:rPr>
+        <w:t>8. What is original or creative.</w:t>
+      </w:r>
+      <w:r>
+        <w:t xml:space="preserve"> You are not the hero — you are an ember possessing fallen heroes, which binds the meta-progression to the fiction; and each run gradually uncovers a branching 'truth' that leads to multiple endings and a hidden final boss, turning a systems-driven roguelike into a narrative one.</w:t>
+      </w:r>
+    </w:p>
+    <w:p>
+      <w:r>
+        <w:rPr>
+          <w:b/>
+        </w:rPr>
+        <w:t>9. Vertical slice plan.</w:t>
+      </w:r>
+      <w:r>
+        <w:t xml:space="preserve"> One complete, playable path: arrive in the camp, possess a hero, descend three procedurally generated floors (combat rooms then a shop then a boss on each), encounter story beats and reach an ending or die, with cross-run unlocks carrying over. This small-but-complete experience is what the submitted build delivers.</w:t>
+      </w:r>
+    </w:p>
+    <w:p>
+      <w:r>
+        <w:rPr>
+          <w:b/>
+        </w:rPr>
+        <w:t>10. Must-have / should-have / could-have / cut-first features.</w:t>
+      </w:r>
+    </w:p>
+    <w:tbl>
+      <w:tblPr>
+        <w:tblStyle w:val="TableGrid"/>
+        <w:tblW w:type="auto" w:w="0"/>
+        <w:tblLook w:firstColumn="1" w:firstRow="1" w:lastColumn="0" w:lastRow="0" w:noHBand="0" w:noVBand="1" w:val="04A0"/>
+      </w:tblPr>
+      <w:tblGrid>
+        <w:gridCol w:w="4703"/>
+        <w:gridCol w:w="4703"/>
+      </w:tblGrid>
+      <w:tr>
+        <w:tc>
+          <w:tcPr>
+            <w:tcW w:type="dxa" w:w="4703"/>
+          </w:tcPr>
+          <w:p>
+            <w:r>
+              <w:rPr>
+                <w:b/>
+              </w:rPr>
+              <w:t>Priority</w:t>
+            </w:r>
+          </w:p>
+        </w:tc>
+        <w:tc>
+          <w:tcPr>
+            <w:tcW w:type="dxa" w:w="4703"/>
+          </w:tcPr>
+          <w:p>
+            <w:r>
+              <w:rPr>
+                <w:b/>
+              </w:rPr>
+              <w:t>Features</w:t>
+            </w:r>
+          </w:p>
+        </w:tc>
+      </w:tr>
+      <w:tr>
+        <w:tc>
+          <w:tcPr>
+            <w:tcW w:type="dxa" w:w="4703"/>
+          </w:tcPr>
+          <w:p>
+            <w:r>
+              <w:rPr>
+                <w:b w:val="0"/>
+              </w:rPr>
+              <w:t>Must-have</w:t>
+            </w:r>
+          </w:p>
+        </w:tc>
+        <w:tc>
+          <w:tcPr>
+            <w:tcW w:type="dxa" w:w="4703"/>
+          </w:tcPr>
+          <w:p>
+            <w:r>
+              <w:rPr>
+                <w:b w:val="0"/>
+              </w:rPr>
+              <w:t>Player movement and 8-direction aim; normal attack and weapon skills; enemy AI with A* pathfinding; wave-based room combat and clearing; health / damage / death; a floor boss fight; run state reset on death.</w:t>
+            </w:r>
+          </w:p>
+        </w:tc>
+      </w:tr>
+      <w:tr>
+        <w:tc>
+          <w:tcPr>
+            <w:tcW w:type="dxa" w:w="4703"/>
+          </w:tcPr>
+          <w:p>
+            <w:r>
+              <w:rPr>
+                <w:b w:val="0"/>
+              </w:rPr>
+              <w:t>Should-have</w:t>
+            </w:r>
+          </w:p>
+        </w:tc>
+        <w:tc>
+          <w:tcPr>
+            <w:tcW w:type="dxa" w:w="4703"/>
+          </w:tcPr>
+          <w:p>
+            <w:r>
+              <w:rPr>
+                <w:b w:val="0"/>
+              </w:rPr>
+              <w:t>Multiple weapon types and rarities; 1-of-3 talent picks; a shop (forge / enchant / heal); multiple heroes with active skills; pixel-art sprites; audio (SFX and per-floor BGM); full scene flow (title - camp - dungeon - ending); a shared Esc pause menu.</w:t>
+            </w:r>
+          </w:p>
+        </w:tc>
+      </w:tr>
+      <w:tr>
+        <w:tc>
+          <w:tcPr>
+            <w:tcW w:type="dxa" w:w="4703"/>
+          </w:tcPr>
+          <w:p>
+            <w:r>
+              <w:rPr>
+                <w:b w:val="0"/>
+              </w:rPr>
+              <w:t>Could-have</w:t>
+            </w:r>
+          </w:p>
+        </w:tc>
+        <w:tc>
+          <w:tcPr>
+            <w:tcW w:type="dxa" w:w="4703"/>
+          </w:tcPr>
+          <w:p>
+            <w:r>
+              <w:rPr>
+                <w:b w:val="0"/>
+              </w:rPr>
+              <w:t>Expanded talent pool; end-of-run recap; cross-run hero/story unlocks; more enemy variants per floor; a training arena.</w:t>
+            </w:r>
+          </w:p>
+        </w:tc>
+      </w:tr>
+      <w:tr>
+        <w:tc>
+          <w:tcPr>
+            <w:tcW w:type="dxa" w:w="4703"/>
+          </w:tcPr>
+          <w:p>
+            <w:r>
+              <w:rPr>
+                <w:b w:val="0"/>
+              </w:rPr>
+              <w:t>Cut-first</w:t>
+            </w:r>
+          </w:p>
+        </w:tc>
+        <w:tc>
+          <w:tcPr>
+            <w:tcW w:type="dxa" w:w="4703"/>
+          </w:tcPr>
+          <w:p>
+            <w:r>
+              <w:rPr>
+                <w:b w:val="0"/>
+              </w:rPr>
+              <w:t>Multiplayer / co-op; full voice acting; mobile / touch controls; an online leaderboard; full sprite-sheet animation.</w:t>
+            </w:r>
+          </w:p>
+        </w:tc>
+      </w:tr>
+    </w:tbl>
+    <w:p>
+      <w:r>
+        <w:rPr>
+          <w:b/>
+        </w:rPr>
+        <w:t>11. Unity development plan.</w:t>
+      </w:r>
+      <w:r>
+        <w:t xml:space="preserve"> Unity 2022.3 (URP 2D) with the new Input System; content authored as ScriptableObjects; a phased build order (see Section 16 'Development Roadmap') across a modular set of assemblies (see Section 13 'Technical Architecture').</w:t>
+      </w:r>
+    </w:p>
+    <w:p>
+      <w:r>
+        <w:rPr>
+          <w:b/>
+        </w:rPr>
+        <w:t>12. Main systems / scripts.</w:t>
+      </w:r>
+      <w:r>
+        <w:t xml:space="preserve"> GameManager, RunState and PersistentState; CharacterStats with a StatModifier stack; Health / IDamageable; PlayerController, PlayerWeaponHandler and hero-skill handlers; a NavGrid A* navigator with per-enemy AI; DungeonGenerator and RoomController; the GameBootstrap and TrainingBootstrap drivers; and code-built uGUI (HUD, weapon panel, pause menu, dialogue / choice, overlays). See Section 13.</w:t>
+      </w:r>
+    </w:p>
+    <w:p>
+      <w:r>
+        <w:rPr>
+          <w:b/>
+        </w:rPr>
+        <w:t>13. Asset / resource plan.</w:t>
+      </w:r>
+      <w:r>
+        <w:t xml:space="preserve"> Art, audio and the font are sourced from licensed third-party packs (0x72, Kenney, LPC/wulax, CraftPix, DCSS, and the Ark Pixel font), integrated into the game and credited in ATTRIBUTIONS.md and an in-game Credits screen. No AI-generated assets are used. The earlier Blender-to-anime pipeline in Section 11 was not pursued (see the Design Evolution addendum).</w:t>
+      </w:r>
+    </w:p>
+    <w:p>
+      <w:r>
+        <w:rPr>
+          <w:b/>
+        </w:rPr>
+        <w:t>14. Legal, ethical, social, accessibility and security considerations.</w:t>
+      </w:r>
+    </w:p>
+    <w:tbl>
+      <w:tblPr>
+        <w:tblStyle w:val="TableGrid"/>
+        <w:tblW w:type="auto" w:w="0"/>
+        <w:tblLook w:firstColumn="1" w:firstRow="1" w:lastColumn="0" w:lastRow="0" w:noHBand="0" w:noVBand="1" w:val="04A0"/>
+      </w:tblPr>
+      <w:tblGrid>
+        <w:gridCol w:w="4703"/>
+        <w:gridCol w:w="4703"/>
+      </w:tblGrid>
+      <w:tr>
+        <w:tc>
+          <w:tcPr>
+            <w:tcW w:type="dxa" w:w="4703"/>
+          </w:tcPr>
+          <w:p>
+            <w:r>
+              <w:rPr>
+                <w:b/>
+              </w:rPr>
+              <w:t>Area</w:t>
+            </w:r>
+          </w:p>
+        </w:tc>
+        <w:tc>
+          <w:tcPr>
+            <w:tcW w:type="dxa" w:w="4703"/>
+          </w:tcPr>
+          <w:p>
+            <w:r>
+              <w:rPr>
+                <w:b/>
+              </w:rPr>
+              <w:t>Approach</w:t>
+            </w:r>
+          </w:p>
+        </w:tc>
+      </w:tr>
+      <w:tr>
+        <w:tc>
+          <w:tcPr>
+            <w:tcW w:type="dxa" w:w="4703"/>
+          </w:tcPr>
+          <w:p>
+            <w:r>
+              <w:rPr>
+                <w:b w:val="0"/>
+              </w:rPr>
+              <w:t>Legal</w:t>
+            </w:r>
+          </w:p>
+        </w:tc>
+        <w:tc>
+          <w:tcPr>
+            <w:tcW w:type="dxa" w:w="4703"/>
+          </w:tcPr>
+          <w:p>
+            <w:r>
+              <w:rPr>
+                <w:b w:val="0"/>
+              </w:rPr>
+              <w:t>All art, audio and the font are third-party assets used under their licences (CC0 / CC-BY-SA 3.0 / SIL OFL 1.1 / CraftPix Free). Attribution and the LPC ShareAlike obligation are met via ATTRIBUTIONS.md, a bundled licence file, and an in-game Credits screen; raw source files are kept out of the repository.</w:t>
+            </w:r>
+          </w:p>
+        </w:tc>
+      </w:tr>
+      <w:tr>
+        <w:tc>
+          <w:tcPr>
+            <w:tcW w:type="dxa" w:w="4703"/>
+          </w:tcPr>
+          <w:p>
+            <w:r>
+              <w:rPr>
+                <w:b w:val="0"/>
+              </w:rPr>
+              <w:t>Ethical</w:t>
+            </w:r>
+          </w:p>
+        </w:tc>
+        <w:tc>
+          <w:tcPr>
+            <w:tcW w:type="dxa" w:w="4703"/>
+          </w:tcPr>
+          <w:p>
+            <w:r>
+              <w:rPr>
+                <w:b w:val="0"/>
+              </w:rPr>
+              <w:t>AI coding assistance was used and is disclosed honestly (AI_USAGE.md); no AI-generated art or audio; editor-only debug shortcuts were removed from the release build.</w:t>
+            </w:r>
+          </w:p>
+        </w:tc>
+      </w:tr>
+      <w:tr>
+        <w:tc>
+          <w:tcPr>
+            <w:tcW w:type="dxa" w:w="4703"/>
+          </w:tcPr>
+          <w:p>
+            <w:r>
+              <w:rPr>
+                <w:b w:val="0"/>
+              </w:rPr>
+              <w:t>Social</w:t>
+            </w:r>
+          </w:p>
+        </w:tc>
+        <w:tc>
+          <w:tcPr>
+            <w:tcW w:type="dxa" w:w="4703"/>
+          </w:tcPr>
+          <w:p>
+            <w:r>
+              <w:rPr>
+                <w:b w:val="0"/>
+              </w:rPr>
+              <w:t>PG-level stylised fantasy violence only; no online, user-generated-content or communication features; no targeting of real people or groups.</w:t>
+            </w:r>
+          </w:p>
+        </w:tc>
+      </w:tr>
+      <w:tr>
+        <w:tc>
+          <w:tcPr>
+            <w:tcW w:type="dxa" w:w="4703"/>
+          </w:tcPr>
+          <w:p>
+            <w:r>
+              <w:rPr>
+                <w:b w:val="0"/>
+              </w:rPr>
+              <w:t>Accessibility</w:t>
+            </w:r>
+          </w:p>
+        </w:tc>
+        <w:tc>
+          <w:tcPr>
+            <w:tcW w:type="dxa" w:w="4703"/>
+          </w:tcPr>
+          <w:p>
+            <w:r>
+              <w:rPr>
+                <w:b w:val="0"/>
+              </w:rPr>
+              <w:t>A current weak area, recorded as future work: remappable controls, a colour-blind-friendly palette and text-size options. The game already uses high-contrast HUD text and a clear pixel font.</w:t>
+            </w:r>
+          </w:p>
+        </w:tc>
+      </w:tr>
+      <w:tr>
+        <w:tc>
+          <w:tcPr>
+            <w:tcW w:type="dxa" w:w="4703"/>
+          </w:tcPr>
+          <w:p>
+            <w:r>
+              <w:rPr>
+                <w:b w:val="0"/>
+              </w:rPr>
+              <w:t>Security</w:t>
+            </w:r>
+          </w:p>
+        </w:tc>
+        <w:tc>
+          <w:tcPr>
+            <w:tcW w:type="dxa" w:w="4703"/>
+          </w:tcPr>
+          <w:p>
+            <w:r>
+              <w:rPr>
+                <w:b w:val="0"/>
+              </w:rPr>
+              <w:t>Local JSON save only - no accounts, network, telemetry or personal-data collection.</w:t>
+            </w:r>
+          </w:p>
+        </w:tc>
+      </w:tr>
+    </w:tbl>
+    <w:p>
+      <w:r>
+        <w:rPr>
+          <w:b/>
+        </w:rPr>
+        <w:t>15. Development schedule / milestones.</w:t>
+      </w:r>
+      <w:r>
+        <w:t xml:space="preserve"> A phased plan spanning W1-W25+ (see Section 16 'Development Roadmap'); day-to-day progress is planned and tracked through GitHub Issues and a project board.</w:t>
+      </w:r>
+    </w:p>
+    <w:p>
+      <w:pPr>
+        <w:pStyle w:val="Heading1"/>
+      </w:pPr>
+      <w:r>
         <w:rPr>
           <w:color w:val="1F497D"/>
         </w:rPr>
@@ -136,7 +647,10 @@
               <w:jc w:val="left"/>
             </w:pPr>
             <w:r>
-              <w:t>2D Anime Roguelike Action Game</w:t>
+              <w:rPr>
+                <w:b w:val="0"/>
+              </w:rPr>
+              <w:t>Embers of the Three Realms</w:t>
             </w:r>
           </w:p>
         </w:tc>

</xml_diff>